<commit_message>
Reglas universales Word: saneamiento fisico de plantillas base y protocolo obligatorio de consulta de imagenes
</commit_message>
<xml_diff>
--- a/templates/Portada_Informatica_Forense_Base.docx
+++ b/templates/Portada_Informatica_Forense_Base.docx
@@ -222,978 +222,6 @@
         <w:t>INSTITUTO TECNOLOGICO SUPERIOR PROGRESO</w:t>
       </w:r>
     </w:p>
-    <w:p>
-      <w:r>
-        <w:rPr>
-          <w:noProof/>
-        </w:rPr>
-        <mc:AlternateContent>
-          <mc:Choice Requires="wps">
-            <w:drawing>
-              <wp:anchor distT="0" distB="0" distL="114300" distR="114300" simplePos="0" relativeHeight="251668480" behindDoc="0" locked="0" layoutInCell="1" allowOverlap="1" wp14:anchorId="4A73A171" wp14:editId="71696BB4">
-                <wp:simplePos x="0" y="0"/>
-                <wp:positionH relativeFrom="column">
-                  <wp:posOffset>1192530</wp:posOffset>
-                </wp:positionH>
-                <wp:positionV relativeFrom="paragraph">
-                  <wp:posOffset>363220</wp:posOffset>
-                </wp:positionV>
-                <wp:extent cx="4860000" cy="6840000"/>
-                <wp:effectExtent l="0" t="0" r="0" b="0"/>
-                <wp:wrapNone/>
-                <wp:docPr id="244634504" name="Cuadro de texto 6"/>
-                <wp:cNvGraphicFramePr/>
-                <a:graphic xmlns:a="http://schemas.openxmlformats.org/drawingml/2006/main">
-                  <a:graphicData uri="http://schemas.microsoft.com/office/word/2010/wordprocessingShape">
-                    <wps:wsp>
-                      <wps:cNvSpPr txBox="1"/>
-                      <wps:spPr>
-                        <a:xfrm>
-                          <a:off x="0" y="0"/>
-                          <a:ext cx="4860000" cy="6840000"/>
-                        </a:xfrm>
-                        <a:prstGeom prst="rect">
-                          <a:avLst/>
-                        </a:prstGeom>
-                        <a:noFill/>
-                        <a:ln w="6350">
-                          <a:noFill/>
-                        </a:ln>
-                      </wps:spPr>
-                      <wps:txbx>
-                        <w:txbxContent>
-                          <w:p>
-                            <w:pPr>
-                              <w:jc w:val="center"/>
-                              <w:rPr>
-                                <w:rFonts w:ascii="Georgia" w:hAnsi="Georgia"/>
-                                <w:sz w:val="28"/>
-                                <w:szCs w:val="28"/>
-                              </w:rPr>
-                            </w:pPr>
-                            <w:r>
-                              <w:rPr>
-                                <w:rFonts w:ascii="Georgia" w:hAnsi="Georgia"/>
-                                <w:b/>
-                                <w:bCs/>
-                                <w:sz w:val="28"/>
-                                <w:szCs w:val="28"/>
-                              </w:rPr>
-                              <w:t>CARRERA:</w:t>
-                            </w:r>
-                            <w:r>
-                              <w:rPr>
-                                <w:rFonts w:ascii="Georgia" w:hAnsi="Georgia"/>
-                                <w:b/>
-                                <w:bCs/>
-                                <w:sz w:val="28"/>
-                                <w:szCs w:val="28"/>
-                              </w:rPr>
-                              <w:br/>
-                            </w:r>
-                            <w:r>
-                              <w:rPr>
-                                <w:rFonts w:ascii="Georgia" w:hAnsi="Georgia"/>
-                                <w:sz w:val="28"/>
-                                <w:szCs w:val="28"/>
-                              </w:rPr>
-                              <w:t>INGENIERIA EN SISTEMAS COMPUTACIONALES</w:t>
-                            </w:r>
-                          </w:p>
-                          <w:p>
-                            <w:pPr>
-                              <w:jc w:val="center"/>
-                              <w:rPr>
-                                <w:rFonts w:ascii="Georgia" w:hAnsi="Georgia"/>
-                                <w:sz w:val="28"/>
-                                <w:szCs w:val="28"/>
-                              </w:rPr>
-                            </w:pPr>
-                          </w:p>
-                          <w:p>
-                            <w:pPr>
-                              <w:jc w:val="center"/>
-                              <w:rPr>
-                                <w:rFonts w:ascii="Georgia" w:hAnsi="Georgia"/>
-                                <w:sz w:val="28"/>
-                                <w:szCs w:val="28"/>
-                              </w:rPr>
-                            </w:pPr>
-                            <w:r>
-                              <w:rPr>
-                                <w:rFonts w:ascii="Georgia" w:hAnsi="Georgia"/>
-                                <w:b/>
-                                <w:bCs/>
-                                <w:sz w:val="28"/>
-                                <w:szCs w:val="28"/>
-                              </w:rPr>
-                              <w:t>GRADO Y GRUPO:</w:t>
-                            </w:r>
-                            <w:r>
-                              <w:rPr>
-                                <w:rFonts w:ascii="Georgia" w:hAnsi="Georgia"/>
-                                <w:b/>
-                                <w:bCs/>
-                                <w:sz w:val="28"/>
-                                <w:szCs w:val="28"/>
-                              </w:rPr>
-                              <w:br/>
-                            </w:r>
-                            <w:r>
-                              <w:rPr>
-                                <w:rFonts w:ascii="Georgia" w:hAnsi="Georgia"/>
-                                <w:sz w:val="28"/>
-                                <w:szCs w:val="28"/>
-                              </w:rPr>
-                              <w:t>9n</w:t>
-                            </w:r>
-                            <w:r>
-                              <w:rPr>
-                                <w:rFonts w:ascii="Georgia" w:hAnsi="Georgia"/>
-                                <w:sz w:val="28"/>
-                                <w:szCs w:val="28"/>
-                              </w:rPr>
-                              <w:t>o - Grupo 1</w:t>
-                            </w:r>
-                          </w:p>
-                          <w:p>
-                            <w:pPr>
-                              <w:jc w:val="center"/>
-                              <w:rPr>
-                                <w:rFonts w:ascii="Georgia" w:hAnsi="Georgia"/>
-                                <w:b/>
-                                <w:bCs/>
-                                <w:sz w:val="28"/>
-                                <w:szCs w:val="28"/>
-                              </w:rPr>
-                            </w:pPr>
-                          </w:p>
-                          <w:p>
-                            <w:pPr>
-                              <w:jc w:val="center"/>
-                              <w:rPr>
-                                <w:rFonts w:ascii="Georgia" w:hAnsi="Georgia"/>
-                                <w:sz w:val="28"/>
-                                <w:szCs w:val="28"/>
-                              </w:rPr>
-                            </w:pPr>
-                            <w:r>
-                              <w:rPr>
-                                <w:rFonts w:ascii="Georgia" w:hAnsi="Georgia"/>
-                                <w:b/>
-                                <w:bCs/>
-                                <w:sz w:val="28"/>
-                                <w:szCs w:val="28"/>
-                              </w:rPr>
-                              <w:t>MATERIA:</w:t>
-                            </w:r>
-                            <w:r>
-                              <w:rPr>
-                                <w:rFonts w:ascii="Georgia" w:hAnsi="Georgia"/>
-                                <w:b/>
-                                <w:bCs/>
-                                <w:sz w:val="28"/>
-                                <w:szCs w:val="28"/>
-                              </w:rPr>
-                              <w:br/>
-                            </w:r>
-                            <w:r>
-                              <w:rPr>
-                                <w:rFonts w:ascii="Georgia" w:hAnsi="Georgia"/>
-                                <w:sz w:val="28"/>
-                                <w:szCs w:val="28"/>
-                              </w:rPr>
-                              <w:t>INFORMÁTICA FORENSE</w:t>
-                            </w:r>
-                          </w:p>
-                          <w:p>
-                            <w:pPr>
-                              <w:jc w:val="center"/>
-                              <w:rPr>
-                                <w:rFonts w:ascii="Georgia" w:hAnsi="Georgia"/>
-                                <w:b/>
-                                <w:bCs/>
-                                <w:sz w:val="28"/>
-                                <w:szCs w:val="28"/>
-                              </w:rPr>
-                            </w:pPr>
-                          </w:p>
-                          <w:p>
-                            <w:pPr>
-                              <w:jc w:val="center"/>
-                              <w:rPr>
-                                <w:rFonts w:ascii="Georgia" w:hAnsi="Georgia"/>
-                                <w:sz w:val="28"/>
-                                <w:szCs w:val="28"/>
-                              </w:rPr>
-                            </w:pPr>
-                            <w:r>
-                              <w:rPr>
-                                <w:rFonts w:ascii="Georgia" w:hAnsi="Georgia"/>
-                                <w:b/>
-                                <w:bCs/>
-                                <w:sz w:val="28"/>
-                                <w:szCs w:val="28"/>
-                              </w:rPr>
-                              <w:t>TAREA:</w:t>
-                            </w:r>
-                            <w:r>
-                              <w:rPr>
-                                <w:rFonts w:ascii="Georgia" w:hAnsi="Georgia"/>
-                                <w:b/>
-                                <w:bCs/>
-                                <w:sz w:val="28"/>
-                                <w:szCs w:val="28"/>
-                              </w:rPr>
-                              <w:br/>
-                            </w:r>
-                            <w:r>
-                              <w:rPr>
-                                <w:rFonts w:ascii="Georgia" w:hAnsi="Georgia"/>
-                                <w:sz w:val="28"/>
-                                <w:szCs w:val="28"/>
-                              </w:rPr>
-                              <w:t>[Nombre de la Tarea / Actividad]</w:t>
-                            </w:r>
-                          </w:p>
-                          <w:p>
-                            <w:pPr>
-                              <w:jc w:val="center"/>
-                              <w:rPr>
-                                <w:rFonts w:ascii="Georgia" w:hAnsi="Georgia"/>
-                                <w:sz w:val="28"/>
-                                <w:szCs w:val="28"/>
-                              </w:rPr>
-                            </w:pPr>
-                          </w:p>
-                          <w:p>
-                            <w:pPr>
-                              <w:jc w:val="center"/>
-                              <w:rPr>
-                                <w:rFonts w:ascii="Georgia" w:hAnsi="Georgia"/>
-                                <w:sz w:val="28"/>
-                                <w:szCs w:val="28"/>
-                              </w:rPr>
-                            </w:pPr>
-                            <w:r>
-                              <w:rPr>
-                                <w:rFonts w:ascii="Georgia" w:hAnsi="Georgia"/>
-                                <w:b/>
-                                <w:bCs/>
-                                <w:sz w:val="28"/>
-                                <w:szCs w:val="28"/>
-                              </w:rPr>
-                              <w:t>FECHA DE ENTREGA:</w:t>
-                            </w:r>
-                            <w:r>
-                              <w:rPr>
-                                <w:rFonts w:ascii="Georgia" w:hAnsi="Georgia"/>
-                                <w:b/>
-                                <w:bCs/>
-                                <w:sz w:val="28"/>
-                                <w:szCs w:val="28"/>
-                              </w:rPr>
-                              <w:br/>
-                            </w:r>
-                            <w:r>
-                              <w:rPr>
-                                <w:rFonts w:ascii="Georgia" w:hAnsi="Georgia"/>
-                                <w:sz w:val="28"/>
-                                <w:szCs w:val="28"/>
-                              </w:rPr>
-                              <w:t>Septiembre</w:t>
-                            </w:r>
-                            <w:r>
-                              <w:rPr>
-                                <w:rFonts w:ascii="Georgia" w:hAnsi="Georgia"/>
-                                <w:sz w:val="28"/>
-                                <w:szCs w:val="28"/>
-                              </w:rPr>
-                              <w:t xml:space="preserve"> </w:t>
-                            </w:r>
-                            <w:r>
-                              <w:rPr>
-                                <w:rFonts w:ascii="Georgia" w:hAnsi="Georgia"/>
-                                <w:sz w:val="28"/>
-                                <w:szCs w:val="28"/>
-                              </w:rPr>
-                              <w:t>de 2026</w:t>
-                            </w:r>
-                          </w:p>
-                          <w:p>
-                            <w:pPr>
-                              <w:jc w:val="center"/>
-                              <w:rPr>
-                                <w:rFonts w:ascii="Georgia" w:hAnsi="Georgia"/>
-                                <w:sz w:val="28"/>
-                                <w:szCs w:val="28"/>
-                              </w:rPr>
-                            </w:pPr>
-                          </w:p>
-                          <w:p>
-                            <w:pPr>
-                              <w:jc w:val="center"/>
-                              <w:rPr>
-                                <w:rFonts w:ascii="Georgia" w:hAnsi="Georgia"/>
-                                <w:sz w:val="28"/>
-                                <w:szCs w:val="28"/>
-                              </w:rPr>
-                            </w:pPr>
-                            <w:r>
-                              <w:rPr>
-                                <w:rFonts w:ascii="Georgia" w:hAnsi="Georgia"/>
-                                <w:b/>
-                                <w:bCs/>
-                                <w:sz w:val="28"/>
-                                <w:szCs w:val="28"/>
-                              </w:rPr>
-                              <w:t>ESTUDIANTE:</w:t>
-                            </w:r>
-                            <w:r>
-                              <w:rPr>
-                                <w:rFonts w:ascii="Georgia" w:hAnsi="Georgia"/>
-                                <w:b/>
-                                <w:bCs/>
-                                <w:sz w:val="28"/>
-                                <w:szCs w:val="28"/>
-                              </w:rPr>
-                              <w:br/>
-                            </w:r>
-                            <w:r>
-                              <w:rPr>
-                                <w:rFonts w:ascii="Georgia" w:hAnsi="Georgia"/>
-                                <w:sz w:val="28"/>
-                                <w:szCs w:val="28"/>
-                              </w:rPr>
-                              <w:t>Carlos Eduardo Valencia Hernández</w:t>
-                            </w:r>
-                          </w:p>
-                          <w:p>
-                            <w:pPr>
-                              <w:jc w:val="center"/>
-                              <w:rPr>
-                                <w:rFonts w:ascii="Georgia" w:hAnsi="Georgia"/>
-                                <w:sz w:val="28"/>
-                                <w:szCs w:val="28"/>
-                              </w:rPr>
-                            </w:pPr>
-                          </w:p>
-                          <w:p>
-                            <w:pPr>
-                              <w:jc w:val="center"/>
-                              <w:rPr>
-                                <w:rFonts w:ascii="Georgia" w:hAnsi="Georgia"/>
-                                <w:sz w:val="28"/>
-                                <w:szCs w:val="28"/>
-                                <w:lang w:val="pt-BR"/>
-                              </w:rPr>
-                            </w:pPr>
-                            <w:r>
-                              <w:rPr>
-                                <w:rFonts w:ascii="Georgia" w:hAnsi="Georgia"/>
-                                <w:b/>
-                                <w:bCs/>
-                                <w:sz w:val="28"/>
-                                <w:szCs w:val="28"/>
-                                <w:lang w:val="pt-BR"/>
-                              </w:rPr>
-                              <w:t>DOCENTE</w:t>
-                            </w:r>
-                            <w:r>
-                              <w:rPr>
-                                <w:rFonts w:ascii="Georgia" w:hAnsi="Georgia"/>
-                                <w:sz w:val="28"/>
-                                <w:szCs w:val="28"/>
-                                <w:lang w:val="pt-BR"/>
-                              </w:rPr>
-                              <w:t>:</w:t>
-                            </w:r>
-                          </w:p>
-                          <w:p>
-                            <w:pPr>
-                              <w:jc w:val="center"/>
-                              <w:rPr>
-                                <w:rFonts w:ascii="Georgia" w:hAnsi="Georgia"/>
-                                <w:sz w:val="28"/>
-                                <w:szCs w:val="28"/>
-                                <w:lang w:val="pt-BR"/>
-                              </w:rPr>
-                            </w:pPr>
-                            <w:r>
-                              <w:rPr>
-                                <w:rFonts w:ascii="Georgia" w:hAnsi="Georgia"/>
-                                <w:sz w:val="28"/>
-                                <w:szCs w:val="28"/>
-                                <w:lang w:val="pt-BR"/>
-                              </w:rPr>
-                              <w:t>EDGAR ALEJANDRO SAGUNDO DUARTE</w:t>
-                            </w:r>
-                          </w:p>
-                        </w:txbxContent>
-                      </wps:txbx>
-                      <wps:bodyPr rot="0" spcFirstLastPara="0" vertOverflow="overflow" horzOverflow="overflow" vert="horz" wrap="square" lIns="91440" tIns="45720" rIns="91440" bIns="45720" numCol="1" spcCol="0" rtlCol="0" fromWordArt="0" anchor="t" anchorCtr="0" forceAA="0" compatLnSpc="1">
-                        <a:prstTxWarp prst="textNoShape">
-                          <a:avLst/>
-                        </a:prstTxWarp>
-                        <a:noAutofit/>
-                      </wps:bodyPr>
-                    </wps:wsp>
-                  </a:graphicData>
-                </a:graphic>
-                <wp14:sizeRelH relativeFrom="margin">
-                  <wp14:pctWidth>0</wp14:pctWidth>
-                </wp14:sizeRelH>
-                <wp14:sizeRelV relativeFrom="margin">
-                  <wp14:pctHeight>0</wp14:pctHeight>
-                </wp14:sizeRelV>
-              </wp:anchor>
-            </w:drawing>
-          </mc:Choice>
-          <mc:Fallback>
-            <w:pict>
-              <v:shapetype w14:anchorId="4A73A171" id="_x0000_t202" coordsize="21600,21600" o:spt="202" path="m,l,21600r21600,l21600,xe">
-                <v:stroke joinstyle="miter"/>
-                <v:path gradientshapeok="t" o:connecttype="rect"/>
-              </v:shapetype>
-              <v:shape id="Cuadro de texto 6" o:spid="_x0000_s1026" type="#_x0000_t202" style="position:absolute;margin-left:93.9pt;margin-top:28.6pt;width:382.7pt;height:538.6pt;z-index:251668480;visibility:visible;mso-wrap-style:square;mso-width-percent:0;mso-height-percent:0;mso-wrap-distance-left:9pt;mso-wrap-distance-top:0;mso-wrap-distance-right:9pt;mso-wrap-distance-bottom:0;mso-position-horizontal:absolute;mso-position-horizontal-relative:text;mso-position-vertical:absolute;mso-position-vertical-relative:text;mso-width-percent:0;mso-height-percent:0;mso-width-relative:margin;mso-height-relative:margin;v-text-anchor:top" o:gfxdata="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" filled="f" stroked="f" strokeweight=".5pt">
-                <v:textbox>
-                  <w:txbxContent>
-                    <w:p>
-                      <w:pPr>
-                        <w:jc w:val="center"/>
-                        <w:rPr>
-                          <w:rFonts w:ascii="Georgia" w:hAnsi="Georgia"/>
-                          <w:sz w:val="28"/>
-                          <w:szCs w:val="28"/>
-                        </w:rPr>
-                      </w:pPr>
-                      <w:r>
-                        <w:rPr>
-                          <w:rFonts w:ascii="Georgia" w:hAnsi="Georgia"/>
-                          <w:b/>
-                          <w:bCs/>
-                          <w:sz w:val="28"/>
-                          <w:szCs w:val="28"/>
-                        </w:rPr>
-                        <w:t>CARRERA:</w:t>
-                      </w:r>
-                      <w:r>
-                        <w:rPr>
-                          <w:rFonts w:ascii="Georgia" w:hAnsi="Georgia"/>
-                          <w:b/>
-                          <w:bCs/>
-                          <w:sz w:val="28"/>
-                          <w:szCs w:val="28"/>
-                        </w:rPr>
-                        <w:br/>
-                      </w:r>
-                      <w:r>
-                        <w:rPr>
-                          <w:rFonts w:ascii="Georgia" w:hAnsi="Georgia"/>
-                          <w:sz w:val="28"/>
-                          <w:szCs w:val="28"/>
-                        </w:rPr>
-                        <w:t>INGENIERIA EN SISTEMAS COMPUTACIONALES</w:t>
-                      </w:r>
-                    </w:p>
-                    <w:p>
-                      <w:pPr>
-                        <w:jc w:val="center"/>
-                        <w:rPr>
-                          <w:rFonts w:ascii="Georgia" w:hAnsi="Georgia"/>
-                          <w:sz w:val="28"/>
-                          <w:szCs w:val="28"/>
-                        </w:rPr>
-                      </w:pPr>
-                    </w:p>
-                    <w:p>
-                      <w:pPr>
-                        <w:jc w:val="center"/>
-                        <w:rPr>
-                          <w:rFonts w:ascii="Georgia" w:hAnsi="Georgia"/>
-                          <w:sz w:val="28"/>
-                          <w:szCs w:val="28"/>
-                        </w:rPr>
-                      </w:pPr>
-                      <w:r>
-                        <w:rPr>
-                          <w:rFonts w:ascii="Georgia" w:hAnsi="Georgia"/>
-                          <w:b/>
-                          <w:bCs/>
-                          <w:sz w:val="28"/>
-                          <w:szCs w:val="28"/>
-                        </w:rPr>
-                        <w:t>GRADO Y GRUPO:</w:t>
-                      </w:r>
-                      <w:r>
-                        <w:rPr>
-                          <w:rFonts w:ascii="Georgia" w:hAnsi="Georgia"/>
-                          <w:b/>
-                          <w:bCs/>
-                          <w:sz w:val="28"/>
-                          <w:szCs w:val="28"/>
-                        </w:rPr>
-                        <w:br/>
-                      </w:r>
-                      <w:r>
-                        <w:rPr>
-                          <w:rFonts w:ascii="Georgia" w:hAnsi="Georgia"/>
-                          <w:sz w:val="28"/>
-                          <w:szCs w:val="28"/>
-                        </w:rPr>
-                        <w:t>9n</w:t>
-                      </w:r>
-                      <w:r>
-                        <w:rPr>
-                          <w:rFonts w:ascii="Georgia" w:hAnsi="Georgia"/>
-                          <w:sz w:val="28"/>
-                          <w:szCs w:val="28"/>
-                        </w:rPr>
-                        <w:t>o - Grupo 1</w:t>
-                      </w:r>
-                    </w:p>
-                    <w:p>
-                      <w:pPr>
-                        <w:jc w:val="center"/>
-                        <w:rPr>
-                          <w:rFonts w:ascii="Georgia" w:hAnsi="Georgia"/>
-                          <w:b/>
-                          <w:bCs/>
-                          <w:sz w:val="28"/>
-                          <w:szCs w:val="28"/>
-                        </w:rPr>
-                      </w:pPr>
-                    </w:p>
-                    <w:p>
-                      <w:pPr>
-                        <w:jc w:val="center"/>
-                        <w:rPr>
-                          <w:rFonts w:ascii="Georgia" w:hAnsi="Georgia"/>
-                          <w:sz w:val="28"/>
-                          <w:szCs w:val="28"/>
-                        </w:rPr>
-                      </w:pPr>
-                      <w:r>
-                        <w:rPr>
-                          <w:rFonts w:ascii="Georgia" w:hAnsi="Georgia"/>
-                          <w:b/>
-                          <w:bCs/>
-                          <w:sz w:val="28"/>
-                          <w:szCs w:val="28"/>
-                        </w:rPr>
-                        <w:t>MATERIA:</w:t>
-                      </w:r>
-                      <w:r>
-                        <w:rPr>
-                          <w:rFonts w:ascii="Georgia" w:hAnsi="Georgia"/>
-                          <w:b/>
-                          <w:bCs/>
-                          <w:sz w:val="28"/>
-                          <w:szCs w:val="28"/>
-                        </w:rPr>
-                        <w:br/>
-                      </w:r>
-                      <w:r>
-                        <w:rPr>
-                          <w:rFonts w:ascii="Georgia" w:hAnsi="Georgia"/>
-                          <w:sz w:val="28"/>
-                          <w:szCs w:val="28"/>
-                        </w:rPr>
-                        <w:t>INFORMÁTICA FORENSE</w:t>
-                      </w:r>
-                    </w:p>
-                    <w:p>
-                      <w:pPr>
-                        <w:jc w:val="center"/>
-                        <w:rPr>
-                          <w:rFonts w:ascii="Georgia" w:hAnsi="Georgia"/>
-                          <w:b/>
-                          <w:bCs/>
-                          <w:sz w:val="28"/>
-                          <w:szCs w:val="28"/>
-                        </w:rPr>
-                      </w:pPr>
-                    </w:p>
-                    <w:p>
-                      <w:pPr>
-                        <w:jc w:val="center"/>
-                        <w:rPr>
-                          <w:rFonts w:ascii="Georgia" w:hAnsi="Georgia"/>
-                          <w:sz w:val="28"/>
-                          <w:szCs w:val="28"/>
-                        </w:rPr>
-                      </w:pPr>
-                      <w:r>
-                        <w:rPr>
-                          <w:rFonts w:ascii="Georgia" w:hAnsi="Georgia"/>
-                          <w:b/>
-                          <w:bCs/>
-                          <w:sz w:val="28"/>
-                          <w:szCs w:val="28"/>
-                        </w:rPr>
-                        <w:t>TAREA:</w:t>
-                      </w:r>
-                      <w:r>
-                        <w:rPr>
-                          <w:rFonts w:ascii="Georgia" w:hAnsi="Georgia"/>
-                          <w:b/>
-                          <w:bCs/>
-                          <w:sz w:val="28"/>
-                          <w:szCs w:val="28"/>
-                        </w:rPr>
-                        <w:br/>
-                      </w:r>
-                      <w:r>
-                        <w:rPr>
-                          <w:rFonts w:ascii="Georgia" w:hAnsi="Georgia"/>
-                          <w:sz w:val="28"/>
-                          <w:szCs w:val="28"/>
-                        </w:rPr>
-                        <w:t>[Nombre de la Tarea / Actividad]</w:t>
-                      </w:r>
-                    </w:p>
-                    <w:p>
-                      <w:pPr>
-                        <w:jc w:val="center"/>
-                        <w:rPr>
-                          <w:rFonts w:ascii="Georgia" w:hAnsi="Georgia"/>
-                          <w:sz w:val="28"/>
-                          <w:szCs w:val="28"/>
-                        </w:rPr>
-                      </w:pPr>
-                    </w:p>
-                    <w:p>
-                      <w:pPr>
-                        <w:jc w:val="center"/>
-                        <w:rPr>
-                          <w:rFonts w:ascii="Georgia" w:hAnsi="Georgia"/>
-                          <w:sz w:val="28"/>
-                          <w:szCs w:val="28"/>
-                        </w:rPr>
-                      </w:pPr>
-                      <w:r>
-                        <w:rPr>
-                          <w:rFonts w:ascii="Georgia" w:hAnsi="Georgia"/>
-                          <w:b/>
-                          <w:bCs/>
-                          <w:sz w:val="28"/>
-                          <w:szCs w:val="28"/>
-                        </w:rPr>
-                        <w:t>FECHA DE ENTREGA:</w:t>
-                      </w:r>
-                      <w:r>
-                        <w:rPr>
-                          <w:rFonts w:ascii="Georgia" w:hAnsi="Georgia"/>
-                          <w:b/>
-                          <w:bCs/>
-                          <w:sz w:val="28"/>
-                          <w:szCs w:val="28"/>
-                        </w:rPr>
-                        <w:br/>
-                      </w:r>
-                      <w:r>
-                        <w:rPr>
-                          <w:rFonts w:ascii="Georgia" w:hAnsi="Georgia"/>
-                          <w:sz w:val="28"/>
-                          <w:szCs w:val="28"/>
-                        </w:rPr>
-                        <w:t>Septiembre</w:t>
-                      </w:r>
-                      <w:r>
-                        <w:rPr>
-                          <w:rFonts w:ascii="Georgia" w:hAnsi="Georgia"/>
-                          <w:sz w:val="28"/>
-                          <w:szCs w:val="28"/>
-                        </w:rPr>
-                        <w:t xml:space="preserve"> </w:t>
-                      </w:r>
-                      <w:r>
-                        <w:rPr>
-                          <w:rFonts w:ascii="Georgia" w:hAnsi="Georgia"/>
-                          <w:sz w:val="28"/>
-                          <w:szCs w:val="28"/>
-                        </w:rPr>
-                        <w:t>de 2026</w:t>
-                      </w:r>
-                    </w:p>
-                    <w:p>
-                      <w:pPr>
-                        <w:jc w:val="center"/>
-                        <w:rPr>
-                          <w:rFonts w:ascii="Georgia" w:hAnsi="Georgia"/>
-                          <w:sz w:val="28"/>
-                          <w:szCs w:val="28"/>
-                        </w:rPr>
-                      </w:pPr>
-                    </w:p>
-                    <w:p>
-                      <w:pPr>
-                        <w:jc w:val="center"/>
-                        <w:rPr>
-                          <w:rFonts w:ascii="Georgia" w:hAnsi="Georgia"/>
-                          <w:sz w:val="28"/>
-                          <w:szCs w:val="28"/>
-                        </w:rPr>
-                      </w:pPr>
-                      <w:r>
-                        <w:rPr>
-                          <w:rFonts w:ascii="Georgia" w:hAnsi="Georgia"/>
-                          <w:b/>
-                          <w:bCs/>
-                          <w:sz w:val="28"/>
-                          <w:szCs w:val="28"/>
-                        </w:rPr>
-                        <w:t>ESTUDIANTE:</w:t>
-                      </w:r>
-                      <w:r>
-                        <w:rPr>
-                          <w:rFonts w:ascii="Georgia" w:hAnsi="Georgia"/>
-                          <w:b/>
-                          <w:bCs/>
-                          <w:sz w:val="28"/>
-                          <w:szCs w:val="28"/>
-                        </w:rPr>
-                        <w:br/>
-                      </w:r>
-                      <w:r>
-                        <w:rPr>
-                          <w:rFonts w:ascii="Georgia" w:hAnsi="Georgia"/>
-                          <w:sz w:val="28"/>
-                          <w:szCs w:val="28"/>
-                        </w:rPr>
-                        <w:t>Carlos Eduardo Valencia Hernández</w:t>
-                      </w:r>
-                    </w:p>
-                    <w:p>
-                      <w:pPr>
-                        <w:jc w:val="center"/>
-                        <w:rPr>
-                          <w:rFonts w:ascii="Georgia" w:hAnsi="Georgia"/>
-                          <w:sz w:val="28"/>
-                          <w:szCs w:val="28"/>
-                        </w:rPr>
-                      </w:pPr>
-                    </w:p>
-                    <w:p>
-                      <w:pPr>
-                        <w:jc w:val="center"/>
-                        <w:rPr>
-                          <w:rFonts w:ascii="Georgia" w:hAnsi="Georgia"/>
-                          <w:sz w:val="28"/>
-                          <w:szCs w:val="28"/>
-                          <w:lang w:val="pt-BR"/>
-                        </w:rPr>
-                      </w:pPr>
-                      <w:r>
-                        <w:rPr>
-                          <w:rFonts w:ascii="Georgia" w:hAnsi="Georgia"/>
-                          <w:b/>
-                          <w:bCs/>
-                          <w:sz w:val="28"/>
-                          <w:szCs w:val="28"/>
-                          <w:lang w:val="pt-BR"/>
-                        </w:rPr>
-                        <w:t>DOCENTE</w:t>
-                      </w:r>
-                      <w:r>
-                        <w:rPr>
-                          <w:rFonts w:ascii="Georgia" w:hAnsi="Georgia"/>
-                          <w:sz w:val="28"/>
-                          <w:szCs w:val="28"/>
-                          <w:lang w:val="pt-BR"/>
-                        </w:rPr>
-                        <w:t>:</w:t>
-                      </w:r>
-                    </w:p>
-                    <w:p>
-                      <w:pPr>
-                        <w:jc w:val="center"/>
-                        <w:rPr>
-                          <w:rFonts w:ascii="Georgia" w:hAnsi="Georgia"/>
-                          <w:sz w:val="28"/>
-                          <w:szCs w:val="28"/>
-                          <w:lang w:val="pt-BR"/>
-                        </w:rPr>
-                      </w:pPr>
-                      <w:r>
-                        <w:rPr>
-                          <w:rFonts w:ascii="Georgia" w:hAnsi="Georgia"/>
-                          <w:sz w:val="28"/>
-                          <w:szCs w:val="28"/>
-                          <w:lang w:val="pt-BR"/>
-                        </w:rPr>
-                        <w:t>EDGAR ALEJANDRO SAGUNDO DUARTE</w:t>
-                      </w:r>
-                    </w:p>
-                  </w:txbxContent>
-                </v:textbox>
-              </v:shape>
-            </w:pict>
-          </mc:Fallback>
-        </mc:AlternateContent>
-      </w:r>
-      <w:r>
-        <w:rPr>
-          <w:noProof/>
-        </w:rPr>
-        <mc:AlternateContent>
-          <mc:Choice Requires="wpg">
-            <w:drawing>
-              <wp:anchor distT="0" distB="0" distL="114300" distR="114300" simplePos="0" relativeHeight="251663360" behindDoc="0" locked="0" layoutInCell="1" allowOverlap="1" wp14:anchorId="6F515471" wp14:editId="27577639">
-                <wp:simplePos x="0" y="0"/>
-                <wp:positionH relativeFrom="column">
-                  <wp:posOffset>306693</wp:posOffset>
-                </wp:positionH>
-                <wp:positionV relativeFrom="paragraph">
-                  <wp:posOffset>915073</wp:posOffset>
-                </wp:positionV>
-                <wp:extent cx="317500" cy="6275851"/>
-                <wp:effectExtent l="0" t="0" r="25400" b="48895"/>
-                <wp:wrapNone/>
-                <wp:docPr id="2031477265" name="Grupo 4"/>
-                <wp:cNvGraphicFramePr/>
-                <a:graphic xmlns:a="http://schemas.openxmlformats.org/drawingml/2006/main">
-                  <a:graphicData uri="http://schemas.microsoft.com/office/word/2010/wordprocessingGroup">
-                    <wpg:wgp>
-                      <wpg:cNvGrpSpPr/>
-                      <wpg:grpSpPr>
-                        <a:xfrm>
-                          <a:off x="0" y="0"/>
-                          <a:ext cx="317500" cy="6275851"/>
-                          <a:chOff x="0" y="0"/>
-                          <a:chExt cx="318052" cy="5760000"/>
-                        </a:xfrm>
-                      </wpg:grpSpPr>
-                      <wps:wsp>
-                        <wps:cNvPr id="385265410" name="Conector recto 2"/>
-                        <wps:cNvCnPr/>
-                        <wps:spPr>
-                          <a:xfrm>
-                            <a:off x="146011" y="0"/>
-                            <a:ext cx="0" cy="5760000"/>
-                          </a:xfrm>
-                          <a:prstGeom prst="line">
-                            <a:avLst/>
-                          </a:prstGeom>
-                          <a:ln w="76200">
-                            <a:solidFill>
-                              <a:srgbClr val="B00549"/>
-                            </a:solidFill>
-                          </a:ln>
-                        </wps:spPr>
-                        <wps:style>
-                          <a:lnRef idx="2">
-                            <a:schemeClr val="accent1"/>
-                          </a:lnRef>
-                          <a:fillRef idx="0">
-                            <a:schemeClr val="accent1"/>
-                          </a:fillRef>
-                          <a:effectRef idx="1">
-                            <a:schemeClr val="accent1"/>
-                          </a:effectRef>
-                          <a:fontRef idx="minor">
-                            <a:schemeClr val="tx1"/>
-                          </a:fontRef>
-                        </wps:style>
-                        <wps:bodyPr/>
-                      </wps:wsp>
-                      <wps:wsp>
-                        <wps:cNvPr id="1027687944" name="Conector recto 2"/>
-                        <wps:cNvCnPr/>
-                        <wps:spPr>
-                          <a:xfrm>
-                            <a:off x="318052" y="5680"/>
-                            <a:ext cx="0" cy="5040000"/>
-                          </a:xfrm>
-                          <a:prstGeom prst="line">
-                            <a:avLst/>
-                          </a:prstGeom>
-                          <a:ln>
-                            <a:solidFill>
-                              <a:srgbClr val="B00549"/>
-                            </a:solidFill>
-                          </a:ln>
-                        </wps:spPr>
-                        <wps:style>
-                          <a:lnRef idx="3">
-                            <a:schemeClr val="dk1"/>
-                          </a:lnRef>
-                          <a:fillRef idx="0">
-                            <a:schemeClr val="dk1"/>
-                          </a:fillRef>
-                          <a:effectRef idx="2">
-                            <a:schemeClr val="dk1"/>
-                          </a:effectRef>
-                          <a:fontRef idx="minor">
-                            <a:schemeClr val="tx1"/>
-                          </a:fontRef>
-                        </wps:style>
-                        <wps:bodyPr/>
-                      </wps:wsp>
-                      <wps:wsp>
-                        <wps:cNvPr id="86592179" name="Conector recto 2"/>
-                        <wps:cNvCnPr/>
-                        <wps:spPr>
-                          <a:xfrm>
-                            <a:off x="0" y="0"/>
-                            <a:ext cx="0" cy="5040000"/>
-                          </a:xfrm>
-                          <a:prstGeom prst="line">
-                            <a:avLst/>
-                          </a:prstGeom>
-                          <a:ln>
-                            <a:solidFill>
-                              <a:srgbClr val="B00549"/>
-                            </a:solidFill>
-                          </a:ln>
-                        </wps:spPr>
-                        <wps:style>
-                          <a:lnRef idx="3">
-                            <a:schemeClr val="dk1"/>
-                          </a:lnRef>
-                          <a:fillRef idx="0">
-                            <a:schemeClr val="dk1"/>
-                          </a:fillRef>
-                          <a:effectRef idx="2">
-                            <a:schemeClr val="dk1"/>
-                          </a:effectRef>
-                          <a:fontRef idx="minor">
-                            <a:schemeClr val="tx1"/>
-                          </a:fontRef>
-                        </wps:style>
-                        <wps:bodyPr/>
-                      </wps:wsp>
-                    </wpg:wgp>
-                  </a:graphicData>
-                </a:graphic>
-                <wp14:sizeRelV relativeFrom="margin">
-                  <wp14:pctHeight>0</wp14:pctHeight>
-                </wp14:sizeRelV>
-              </wp:anchor>
-            </w:drawing>
-          </mc:Choice>
-          <mc:Fallback>
-            <w:pict>
-              <v:group w14:anchorId="12216BCD" id="Grupo 4" o:spid="_x0000_s1026" style="position:absolute;margin-left:24.15pt;margin-top:72.05pt;width:25pt;height:494.15pt;z-index:251663360;mso-height-relative:margin" coordsize="3180,57600" o:gfxdata="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">
-                <v:line id="Conector recto 2" o:spid="_x0000_s1027" style="position:absolute;visibility:visible;mso-wrap-style:square" from="1460,0" to="1460,57600" o:connectortype="straight" o:gfxdata="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" strokecolor="#b00549" strokeweight="6pt">
-                  <v:stroke joinstyle="miter"/>
-                </v:line>
-                <v:line id="Conector recto 2" o:spid="_x0000_s1028" style="position:absolute;visibility:visible;mso-wrap-style:square" from="3180,56" to="3180,50456" o:connectortype="straight" o:gfxdata="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" strokecolor="#b00549" strokeweight="2pt">
-                  <v:stroke joinstyle="miter"/>
-                </v:line>
-                <v:line id="Conector recto 2" o:spid="_x0000_s1029" style="position:absolute;visibility:visible;mso-wrap-style:square" from="0,0" to="0,50400" o:connectortype="straight" o:gfxdata="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" strokecolor="#b00549" strokeweight="2pt">
-                  <v:stroke joinstyle="miter"/>
-                </v:line>
-              </v:group>
-            </w:pict>
-          </mc:Fallback>
-        </mc:AlternateContent>
-      </w:r>
-      <w:r>
-        <w:br w:type="page"/>
-      </w:r>
-    </w:p>
-    <w:p/>
     <w:sectPr>
       <w:headerReference w:type="even" r:id="rId9"/>
       <w:headerReference w:type="default" r:id="rId10"/>

</xml_diff>

<commit_message>
fix(word): restaurar portada completa oficial P[0]-P[1], precargar indice nativo y salto de pagina obligatorio en H1
</commit_message>
<xml_diff>
--- a/templates/Portada_Informatica_Forense_Base.docx
+++ b/templates/Portada_Informatica_Forense_Base.docx
@@ -220,6 +220,977 @@
           <w:szCs w:val="40"/>
         </w:rPr>
         <w:t>INSTITUTO TECNOLOGICO SUPERIOR PROGRESO</w:t>
+      </w:r>
+    </w:p>
+    <w:p>
+      <w:r>
+        <w:rPr>
+          <w:noProof/>
+        </w:rPr>
+        <mc:AlternateContent>
+          <mc:Choice Requires="wps">
+            <w:drawing>
+              <wp:anchor distT="0" distB="0" distL="114300" distR="114300" simplePos="0" relativeHeight="251668480" behindDoc="0" locked="0" layoutInCell="1" allowOverlap="1" wp14:anchorId="4A73A171" wp14:editId="71696BB4">
+                <wp:simplePos x="0" y="0"/>
+                <wp:positionH relativeFrom="column">
+                  <wp:posOffset>1192530</wp:posOffset>
+                </wp:positionH>
+                <wp:positionV relativeFrom="paragraph">
+                  <wp:posOffset>363220</wp:posOffset>
+                </wp:positionV>
+                <wp:extent cx="4860000" cy="6840000"/>
+                <wp:effectExtent l="0" t="0" r="0" b="0"/>
+                <wp:wrapNone/>
+                <wp:docPr id="244634504" name="Cuadro de texto 6"/>
+                <wp:cNvGraphicFramePr/>
+                <a:graphic xmlns:a="http://schemas.openxmlformats.org/drawingml/2006/main">
+                  <a:graphicData uri="http://schemas.microsoft.com/office/word/2010/wordprocessingShape">
+                    <wps:wsp>
+                      <wps:cNvSpPr txBox="1"/>
+                      <wps:spPr>
+                        <a:xfrm>
+                          <a:off x="0" y="0"/>
+                          <a:ext cx="4860000" cy="6840000"/>
+                        </a:xfrm>
+                        <a:prstGeom prst="rect">
+                          <a:avLst/>
+                        </a:prstGeom>
+                        <a:noFill/>
+                        <a:ln w="6350">
+                          <a:noFill/>
+                        </a:ln>
+                      </wps:spPr>
+                      <wps:txbx>
+                        <w:txbxContent>
+                          <w:p>
+                            <w:pPr>
+                              <w:jc w:val="center"/>
+                              <w:rPr>
+                                <w:rFonts w:ascii="Georgia" w:hAnsi="Georgia"/>
+                                <w:sz w:val="28"/>
+                                <w:szCs w:val="28"/>
+                              </w:rPr>
+                            </w:pPr>
+                            <w:r>
+                              <w:rPr>
+                                <w:rFonts w:ascii="Georgia" w:hAnsi="Georgia"/>
+                                <w:b/>
+                                <w:bCs/>
+                                <w:sz w:val="28"/>
+                                <w:szCs w:val="28"/>
+                              </w:rPr>
+                              <w:t>CARRERA:</w:t>
+                            </w:r>
+                            <w:r>
+                              <w:rPr>
+                                <w:rFonts w:ascii="Georgia" w:hAnsi="Georgia"/>
+                                <w:b/>
+                                <w:bCs/>
+                                <w:sz w:val="28"/>
+                                <w:szCs w:val="28"/>
+                              </w:rPr>
+                              <w:br/>
+                            </w:r>
+                            <w:r>
+                              <w:rPr>
+                                <w:rFonts w:ascii="Georgia" w:hAnsi="Georgia"/>
+                                <w:sz w:val="28"/>
+                                <w:szCs w:val="28"/>
+                              </w:rPr>
+                              <w:t>INGENIERIA EN SISTEMAS COMPUTACIONALES</w:t>
+                            </w:r>
+                          </w:p>
+                          <w:p>
+                            <w:pPr>
+                              <w:jc w:val="center"/>
+                              <w:rPr>
+                                <w:rFonts w:ascii="Georgia" w:hAnsi="Georgia"/>
+                                <w:sz w:val="28"/>
+                                <w:szCs w:val="28"/>
+                              </w:rPr>
+                            </w:pPr>
+                          </w:p>
+                          <w:p>
+                            <w:pPr>
+                              <w:jc w:val="center"/>
+                              <w:rPr>
+                                <w:rFonts w:ascii="Georgia" w:hAnsi="Georgia"/>
+                                <w:sz w:val="28"/>
+                                <w:szCs w:val="28"/>
+                              </w:rPr>
+                            </w:pPr>
+                            <w:r>
+                              <w:rPr>
+                                <w:rFonts w:ascii="Georgia" w:hAnsi="Georgia"/>
+                                <w:b/>
+                                <w:bCs/>
+                                <w:sz w:val="28"/>
+                                <w:szCs w:val="28"/>
+                              </w:rPr>
+                              <w:t>GRADO Y GRUPO:</w:t>
+                            </w:r>
+                            <w:r>
+                              <w:rPr>
+                                <w:rFonts w:ascii="Georgia" w:hAnsi="Georgia"/>
+                                <w:b/>
+                                <w:bCs/>
+                                <w:sz w:val="28"/>
+                                <w:szCs w:val="28"/>
+                              </w:rPr>
+                              <w:br/>
+                            </w:r>
+                            <w:r>
+                              <w:rPr>
+                                <w:rFonts w:ascii="Georgia" w:hAnsi="Georgia"/>
+                                <w:sz w:val="28"/>
+                                <w:szCs w:val="28"/>
+                              </w:rPr>
+                              <w:t>9n</w:t>
+                            </w:r>
+                            <w:r>
+                              <w:rPr>
+                                <w:rFonts w:ascii="Georgia" w:hAnsi="Georgia"/>
+                                <w:sz w:val="28"/>
+                                <w:szCs w:val="28"/>
+                              </w:rPr>
+                              <w:t>o - Grupo 1</w:t>
+                            </w:r>
+                          </w:p>
+                          <w:p>
+                            <w:pPr>
+                              <w:jc w:val="center"/>
+                              <w:rPr>
+                                <w:rFonts w:ascii="Georgia" w:hAnsi="Georgia"/>
+                                <w:b/>
+                                <w:bCs/>
+                                <w:sz w:val="28"/>
+                                <w:szCs w:val="28"/>
+                              </w:rPr>
+                            </w:pPr>
+                          </w:p>
+                          <w:p>
+                            <w:pPr>
+                              <w:jc w:val="center"/>
+                              <w:rPr>
+                                <w:rFonts w:ascii="Georgia" w:hAnsi="Georgia"/>
+                                <w:sz w:val="28"/>
+                                <w:szCs w:val="28"/>
+                              </w:rPr>
+                            </w:pPr>
+                            <w:r>
+                              <w:rPr>
+                                <w:rFonts w:ascii="Georgia" w:hAnsi="Georgia"/>
+                                <w:b/>
+                                <w:bCs/>
+                                <w:sz w:val="28"/>
+                                <w:szCs w:val="28"/>
+                              </w:rPr>
+                              <w:t>MATERIA:</w:t>
+                            </w:r>
+                            <w:r>
+                              <w:rPr>
+                                <w:rFonts w:ascii="Georgia" w:hAnsi="Georgia"/>
+                                <w:b/>
+                                <w:bCs/>
+                                <w:sz w:val="28"/>
+                                <w:szCs w:val="28"/>
+                              </w:rPr>
+                              <w:br/>
+                            </w:r>
+                            <w:r>
+                              <w:rPr>
+                                <w:rFonts w:ascii="Georgia" w:hAnsi="Georgia"/>
+                                <w:sz w:val="28"/>
+                                <w:szCs w:val="28"/>
+                              </w:rPr>
+                              <w:t>INFORMÁTICA FORENSE</w:t>
+                            </w:r>
+                          </w:p>
+                          <w:p>
+                            <w:pPr>
+                              <w:jc w:val="center"/>
+                              <w:rPr>
+                                <w:rFonts w:ascii="Georgia" w:hAnsi="Georgia"/>
+                                <w:b/>
+                                <w:bCs/>
+                                <w:sz w:val="28"/>
+                                <w:szCs w:val="28"/>
+                              </w:rPr>
+                            </w:pPr>
+                          </w:p>
+                          <w:p>
+                            <w:pPr>
+                              <w:jc w:val="center"/>
+                              <w:rPr>
+                                <w:rFonts w:ascii="Georgia" w:hAnsi="Georgia"/>
+                                <w:sz w:val="28"/>
+                                <w:szCs w:val="28"/>
+                              </w:rPr>
+                            </w:pPr>
+                            <w:r>
+                              <w:rPr>
+                                <w:rFonts w:ascii="Georgia" w:hAnsi="Georgia"/>
+                                <w:b/>
+                                <w:bCs/>
+                                <w:sz w:val="28"/>
+                                <w:szCs w:val="28"/>
+                              </w:rPr>
+                              <w:t>TAREA:</w:t>
+                            </w:r>
+                            <w:r>
+                              <w:rPr>
+                                <w:rFonts w:ascii="Georgia" w:hAnsi="Georgia"/>
+                                <w:b/>
+                                <w:bCs/>
+                                <w:sz w:val="28"/>
+                                <w:szCs w:val="28"/>
+                              </w:rPr>
+                              <w:br/>
+                            </w:r>
+                            <w:r>
+                              <w:rPr>
+                                <w:rFonts w:ascii="Georgia" w:hAnsi="Georgia"/>
+                                <w:sz w:val="28"/>
+                                <w:szCs w:val="28"/>
+                              </w:rPr>
+                              <w:t>[Nombre de la Tarea / Actividad]</w:t>
+                            </w:r>
+                          </w:p>
+                          <w:p>
+                            <w:pPr>
+                              <w:jc w:val="center"/>
+                              <w:rPr>
+                                <w:rFonts w:ascii="Georgia" w:hAnsi="Georgia"/>
+                                <w:sz w:val="28"/>
+                                <w:szCs w:val="28"/>
+                              </w:rPr>
+                            </w:pPr>
+                          </w:p>
+                          <w:p>
+                            <w:pPr>
+                              <w:jc w:val="center"/>
+                              <w:rPr>
+                                <w:rFonts w:ascii="Georgia" w:hAnsi="Georgia"/>
+                                <w:sz w:val="28"/>
+                                <w:szCs w:val="28"/>
+                              </w:rPr>
+                            </w:pPr>
+                            <w:r>
+                              <w:rPr>
+                                <w:rFonts w:ascii="Georgia" w:hAnsi="Georgia"/>
+                                <w:b/>
+                                <w:bCs/>
+                                <w:sz w:val="28"/>
+                                <w:szCs w:val="28"/>
+                              </w:rPr>
+                              <w:t>FECHA DE ENTREGA:</w:t>
+                            </w:r>
+                            <w:r>
+                              <w:rPr>
+                                <w:rFonts w:ascii="Georgia" w:hAnsi="Georgia"/>
+                                <w:b/>
+                                <w:bCs/>
+                                <w:sz w:val="28"/>
+                                <w:szCs w:val="28"/>
+                              </w:rPr>
+                              <w:br/>
+                            </w:r>
+                            <w:r>
+                              <w:rPr>
+                                <w:rFonts w:ascii="Georgia" w:hAnsi="Georgia"/>
+                                <w:sz w:val="28"/>
+                                <w:szCs w:val="28"/>
+                              </w:rPr>
+                              <w:t>Septiembre</w:t>
+                            </w:r>
+                            <w:r>
+                              <w:rPr>
+                                <w:rFonts w:ascii="Georgia" w:hAnsi="Georgia"/>
+                                <w:sz w:val="28"/>
+                                <w:szCs w:val="28"/>
+                              </w:rPr>
+                              <w:t xml:space="preserve"> </w:t>
+                            </w:r>
+                            <w:r>
+                              <w:rPr>
+                                <w:rFonts w:ascii="Georgia" w:hAnsi="Georgia"/>
+                                <w:sz w:val="28"/>
+                                <w:szCs w:val="28"/>
+                              </w:rPr>
+                              <w:t>de 2026</w:t>
+                            </w:r>
+                          </w:p>
+                          <w:p>
+                            <w:pPr>
+                              <w:jc w:val="center"/>
+                              <w:rPr>
+                                <w:rFonts w:ascii="Georgia" w:hAnsi="Georgia"/>
+                                <w:sz w:val="28"/>
+                                <w:szCs w:val="28"/>
+                              </w:rPr>
+                            </w:pPr>
+                          </w:p>
+                          <w:p>
+                            <w:pPr>
+                              <w:jc w:val="center"/>
+                              <w:rPr>
+                                <w:rFonts w:ascii="Georgia" w:hAnsi="Georgia"/>
+                                <w:sz w:val="28"/>
+                                <w:szCs w:val="28"/>
+                              </w:rPr>
+                            </w:pPr>
+                            <w:r>
+                              <w:rPr>
+                                <w:rFonts w:ascii="Georgia" w:hAnsi="Georgia"/>
+                                <w:b/>
+                                <w:bCs/>
+                                <w:sz w:val="28"/>
+                                <w:szCs w:val="28"/>
+                              </w:rPr>
+                              <w:t>ESTUDIANTE:</w:t>
+                            </w:r>
+                            <w:r>
+                              <w:rPr>
+                                <w:rFonts w:ascii="Georgia" w:hAnsi="Georgia"/>
+                                <w:b/>
+                                <w:bCs/>
+                                <w:sz w:val="28"/>
+                                <w:szCs w:val="28"/>
+                              </w:rPr>
+                              <w:br/>
+                            </w:r>
+                            <w:r>
+                              <w:rPr>
+                                <w:rFonts w:ascii="Georgia" w:hAnsi="Georgia"/>
+                                <w:sz w:val="28"/>
+                                <w:szCs w:val="28"/>
+                              </w:rPr>
+                              <w:t>Carlos Eduardo Valencia Hernández</w:t>
+                            </w:r>
+                          </w:p>
+                          <w:p>
+                            <w:pPr>
+                              <w:jc w:val="center"/>
+                              <w:rPr>
+                                <w:rFonts w:ascii="Georgia" w:hAnsi="Georgia"/>
+                                <w:sz w:val="28"/>
+                                <w:szCs w:val="28"/>
+                              </w:rPr>
+                            </w:pPr>
+                          </w:p>
+                          <w:p>
+                            <w:pPr>
+                              <w:jc w:val="center"/>
+                              <w:rPr>
+                                <w:rFonts w:ascii="Georgia" w:hAnsi="Georgia"/>
+                                <w:sz w:val="28"/>
+                                <w:szCs w:val="28"/>
+                                <w:lang w:val="pt-BR"/>
+                              </w:rPr>
+                            </w:pPr>
+                            <w:r>
+                              <w:rPr>
+                                <w:rFonts w:ascii="Georgia" w:hAnsi="Georgia"/>
+                                <w:b/>
+                                <w:bCs/>
+                                <w:sz w:val="28"/>
+                                <w:szCs w:val="28"/>
+                                <w:lang w:val="pt-BR"/>
+                              </w:rPr>
+                              <w:t>DOCENTE</w:t>
+                            </w:r>
+                            <w:r>
+                              <w:rPr>
+                                <w:rFonts w:ascii="Georgia" w:hAnsi="Georgia"/>
+                                <w:sz w:val="28"/>
+                                <w:szCs w:val="28"/>
+                                <w:lang w:val="pt-BR"/>
+                              </w:rPr>
+                              <w:t>:</w:t>
+                            </w:r>
+                          </w:p>
+                          <w:p>
+                            <w:pPr>
+                              <w:jc w:val="center"/>
+                              <w:rPr>
+                                <w:rFonts w:ascii="Georgia" w:hAnsi="Georgia"/>
+                                <w:sz w:val="28"/>
+                                <w:szCs w:val="28"/>
+                                <w:lang w:val="pt-BR"/>
+                              </w:rPr>
+                            </w:pPr>
+                            <w:r>
+                              <w:rPr>
+                                <w:rFonts w:ascii="Georgia" w:hAnsi="Georgia"/>
+                                <w:sz w:val="28"/>
+                                <w:szCs w:val="28"/>
+                                <w:lang w:val="pt-BR"/>
+                              </w:rPr>
+                              <w:t>EDGAR ALEJANDRO SAGUNDO DUARTE</w:t>
+                            </w:r>
+                          </w:p>
+                        </w:txbxContent>
+                      </wps:txbx>
+                      <wps:bodyPr rot="0" spcFirstLastPara="0" vertOverflow="overflow" horzOverflow="overflow" vert="horz" wrap="square" lIns="91440" tIns="45720" rIns="91440" bIns="45720" numCol="1" spcCol="0" rtlCol="0" fromWordArt="0" anchor="t" anchorCtr="0" forceAA="0" compatLnSpc="1">
+                        <a:prstTxWarp prst="textNoShape">
+                          <a:avLst/>
+                        </a:prstTxWarp>
+                        <a:noAutofit/>
+                      </wps:bodyPr>
+                    </wps:wsp>
+                  </a:graphicData>
+                </a:graphic>
+                <wp14:sizeRelH relativeFrom="margin">
+                  <wp14:pctWidth>0</wp14:pctWidth>
+                </wp14:sizeRelH>
+                <wp14:sizeRelV relativeFrom="margin">
+                  <wp14:pctHeight>0</wp14:pctHeight>
+                </wp14:sizeRelV>
+              </wp:anchor>
+            </w:drawing>
+          </mc:Choice>
+          <mc:Fallback>
+            <w:pict>
+              <v:shapetype w14:anchorId="4A73A171" id="_x0000_t202" coordsize="21600,21600" o:spt="202" path="m,l,21600r21600,l21600,xe">
+                <v:stroke joinstyle="miter"/>
+                <v:path gradientshapeok="t" o:connecttype="rect"/>
+              </v:shapetype>
+              <v:shape id="Cuadro de texto 6" o:spid="_x0000_s1026" type="#_x0000_t202" style="position:absolute;margin-left:93.9pt;margin-top:28.6pt;width:382.7pt;height:538.6pt;z-index:251668480;visibility:visible;mso-wrap-style:square;mso-width-percent:0;mso-height-percent:0;mso-wrap-distance-left:9pt;mso-wrap-distance-top:0;mso-wrap-distance-right:9pt;mso-wrap-distance-bottom:0;mso-position-horizontal:absolute;mso-position-horizontal-relative:text;mso-position-vertical:absolute;mso-position-vertical-relative:text;mso-width-percent:0;mso-height-percent:0;mso-width-relative:margin;mso-height-relative:margin;v-text-anchor:top" o:gfxdata="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" filled="f" stroked="f" strokeweight=".5pt">
+                <v:textbox>
+                  <w:txbxContent>
+                    <w:p>
+                      <w:pPr>
+                        <w:jc w:val="center"/>
+                        <w:rPr>
+                          <w:rFonts w:ascii="Georgia" w:hAnsi="Georgia"/>
+                          <w:sz w:val="28"/>
+                          <w:szCs w:val="28"/>
+                        </w:rPr>
+                      </w:pPr>
+                      <w:r>
+                        <w:rPr>
+                          <w:rFonts w:ascii="Georgia" w:hAnsi="Georgia"/>
+                          <w:b/>
+                          <w:bCs/>
+                          <w:sz w:val="28"/>
+                          <w:szCs w:val="28"/>
+                        </w:rPr>
+                        <w:t>CARRERA:</w:t>
+                      </w:r>
+                      <w:r>
+                        <w:rPr>
+                          <w:rFonts w:ascii="Georgia" w:hAnsi="Georgia"/>
+                          <w:b/>
+                          <w:bCs/>
+                          <w:sz w:val="28"/>
+                          <w:szCs w:val="28"/>
+                        </w:rPr>
+                        <w:br/>
+                      </w:r>
+                      <w:r>
+                        <w:rPr>
+                          <w:rFonts w:ascii="Georgia" w:hAnsi="Georgia"/>
+                          <w:sz w:val="28"/>
+                          <w:szCs w:val="28"/>
+                        </w:rPr>
+                        <w:t>INGENIERIA EN SISTEMAS COMPUTACIONALES</w:t>
+                      </w:r>
+                    </w:p>
+                    <w:p>
+                      <w:pPr>
+                        <w:jc w:val="center"/>
+                        <w:rPr>
+                          <w:rFonts w:ascii="Georgia" w:hAnsi="Georgia"/>
+                          <w:sz w:val="28"/>
+                          <w:szCs w:val="28"/>
+                        </w:rPr>
+                      </w:pPr>
+                    </w:p>
+                    <w:p>
+                      <w:pPr>
+                        <w:jc w:val="center"/>
+                        <w:rPr>
+                          <w:rFonts w:ascii="Georgia" w:hAnsi="Georgia"/>
+                          <w:sz w:val="28"/>
+                          <w:szCs w:val="28"/>
+                        </w:rPr>
+                      </w:pPr>
+                      <w:r>
+                        <w:rPr>
+                          <w:rFonts w:ascii="Georgia" w:hAnsi="Georgia"/>
+                          <w:b/>
+                          <w:bCs/>
+                          <w:sz w:val="28"/>
+                          <w:szCs w:val="28"/>
+                        </w:rPr>
+                        <w:t>GRADO Y GRUPO:</w:t>
+                      </w:r>
+                      <w:r>
+                        <w:rPr>
+                          <w:rFonts w:ascii="Georgia" w:hAnsi="Georgia"/>
+                          <w:b/>
+                          <w:bCs/>
+                          <w:sz w:val="28"/>
+                          <w:szCs w:val="28"/>
+                        </w:rPr>
+                        <w:br/>
+                      </w:r>
+                      <w:r>
+                        <w:rPr>
+                          <w:rFonts w:ascii="Georgia" w:hAnsi="Georgia"/>
+                          <w:sz w:val="28"/>
+                          <w:szCs w:val="28"/>
+                        </w:rPr>
+                        <w:t>9n</w:t>
+                      </w:r>
+                      <w:r>
+                        <w:rPr>
+                          <w:rFonts w:ascii="Georgia" w:hAnsi="Georgia"/>
+                          <w:sz w:val="28"/>
+                          <w:szCs w:val="28"/>
+                        </w:rPr>
+                        <w:t>o - Grupo 1</w:t>
+                      </w:r>
+                    </w:p>
+                    <w:p>
+                      <w:pPr>
+                        <w:jc w:val="center"/>
+                        <w:rPr>
+                          <w:rFonts w:ascii="Georgia" w:hAnsi="Georgia"/>
+                          <w:b/>
+                          <w:bCs/>
+                          <w:sz w:val="28"/>
+                          <w:szCs w:val="28"/>
+                        </w:rPr>
+                      </w:pPr>
+                    </w:p>
+                    <w:p>
+                      <w:pPr>
+                        <w:jc w:val="center"/>
+                        <w:rPr>
+                          <w:rFonts w:ascii="Georgia" w:hAnsi="Georgia"/>
+                          <w:sz w:val="28"/>
+                          <w:szCs w:val="28"/>
+                        </w:rPr>
+                      </w:pPr>
+                      <w:r>
+                        <w:rPr>
+                          <w:rFonts w:ascii="Georgia" w:hAnsi="Georgia"/>
+                          <w:b/>
+                          <w:bCs/>
+                          <w:sz w:val="28"/>
+                          <w:szCs w:val="28"/>
+                        </w:rPr>
+                        <w:t>MATERIA:</w:t>
+                      </w:r>
+                      <w:r>
+                        <w:rPr>
+                          <w:rFonts w:ascii="Georgia" w:hAnsi="Georgia"/>
+                          <w:b/>
+                          <w:bCs/>
+                          <w:sz w:val="28"/>
+                          <w:szCs w:val="28"/>
+                        </w:rPr>
+                        <w:br/>
+                      </w:r>
+                      <w:r>
+                        <w:rPr>
+                          <w:rFonts w:ascii="Georgia" w:hAnsi="Georgia"/>
+                          <w:sz w:val="28"/>
+                          <w:szCs w:val="28"/>
+                        </w:rPr>
+                        <w:t>INFORMÁTICA FORENSE</w:t>
+                      </w:r>
+                    </w:p>
+                    <w:p>
+                      <w:pPr>
+                        <w:jc w:val="center"/>
+                        <w:rPr>
+                          <w:rFonts w:ascii="Georgia" w:hAnsi="Georgia"/>
+                          <w:b/>
+                          <w:bCs/>
+                          <w:sz w:val="28"/>
+                          <w:szCs w:val="28"/>
+                        </w:rPr>
+                      </w:pPr>
+                    </w:p>
+                    <w:p>
+                      <w:pPr>
+                        <w:jc w:val="center"/>
+                        <w:rPr>
+                          <w:rFonts w:ascii="Georgia" w:hAnsi="Georgia"/>
+                          <w:sz w:val="28"/>
+                          <w:szCs w:val="28"/>
+                        </w:rPr>
+                      </w:pPr>
+                      <w:r>
+                        <w:rPr>
+                          <w:rFonts w:ascii="Georgia" w:hAnsi="Georgia"/>
+                          <w:b/>
+                          <w:bCs/>
+                          <w:sz w:val="28"/>
+                          <w:szCs w:val="28"/>
+                        </w:rPr>
+                        <w:t>TAREA:</w:t>
+                      </w:r>
+                      <w:r>
+                        <w:rPr>
+                          <w:rFonts w:ascii="Georgia" w:hAnsi="Georgia"/>
+                          <w:b/>
+                          <w:bCs/>
+                          <w:sz w:val="28"/>
+                          <w:szCs w:val="28"/>
+                        </w:rPr>
+                        <w:br/>
+                      </w:r>
+                      <w:r>
+                        <w:rPr>
+                          <w:rFonts w:ascii="Georgia" w:hAnsi="Georgia"/>
+                          <w:sz w:val="28"/>
+                          <w:szCs w:val="28"/>
+                        </w:rPr>
+                        <w:t>[Nombre de la Tarea / Actividad]</w:t>
+                      </w:r>
+                    </w:p>
+                    <w:p>
+                      <w:pPr>
+                        <w:jc w:val="center"/>
+                        <w:rPr>
+                          <w:rFonts w:ascii="Georgia" w:hAnsi="Georgia"/>
+                          <w:sz w:val="28"/>
+                          <w:szCs w:val="28"/>
+                        </w:rPr>
+                      </w:pPr>
+                    </w:p>
+                    <w:p>
+                      <w:pPr>
+                        <w:jc w:val="center"/>
+                        <w:rPr>
+                          <w:rFonts w:ascii="Georgia" w:hAnsi="Georgia"/>
+                          <w:sz w:val="28"/>
+                          <w:szCs w:val="28"/>
+                        </w:rPr>
+                      </w:pPr>
+                      <w:r>
+                        <w:rPr>
+                          <w:rFonts w:ascii="Georgia" w:hAnsi="Georgia"/>
+                          <w:b/>
+                          <w:bCs/>
+                          <w:sz w:val="28"/>
+                          <w:szCs w:val="28"/>
+                        </w:rPr>
+                        <w:t>FECHA DE ENTREGA:</w:t>
+                      </w:r>
+                      <w:r>
+                        <w:rPr>
+                          <w:rFonts w:ascii="Georgia" w:hAnsi="Georgia"/>
+                          <w:b/>
+                          <w:bCs/>
+                          <w:sz w:val="28"/>
+                          <w:szCs w:val="28"/>
+                        </w:rPr>
+                        <w:br/>
+                      </w:r>
+                      <w:r>
+                        <w:rPr>
+                          <w:rFonts w:ascii="Georgia" w:hAnsi="Georgia"/>
+                          <w:sz w:val="28"/>
+                          <w:szCs w:val="28"/>
+                        </w:rPr>
+                        <w:t>Septiembre</w:t>
+                      </w:r>
+                      <w:r>
+                        <w:rPr>
+                          <w:rFonts w:ascii="Georgia" w:hAnsi="Georgia"/>
+                          <w:sz w:val="28"/>
+                          <w:szCs w:val="28"/>
+                        </w:rPr>
+                        <w:t xml:space="preserve"> </w:t>
+                      </w:r>
+                      <w:r>
+                        <w:rPr>
+                          <w:rFonts w:ascii="Georgia" w:hAnsi="Georgia"/>
+                          <w:sz w:val="28"/>
+                          <w:szCs w:val="28"/>
+                        </w:rPr>
+                        <w:t>de 2026</w:t>
+                      </w:r>
+                    </w:p>
+                    <w:p>
+                      <w:pPr>
+                        <w:jc w:val="center"/>
+                        <w:rPr>
+                          <w:rFonts w:ascii="Georgia" w:hAnsi="Georgia"/>
+                          <w:sz w:val="28"/>
+                          <w:szCs w:val="28"/>
+                        </w:rPr>
+                      </w:pPr>
+                    </w:p>
+                    <w:p>
+                      <w:pPr>
+                        <w:jc w:val="center"/>
+                        <w:rPr>
+                          <w:rFonts w:ascii="Georgia" w:hAnsi="Georgia"/>
+                          <w:sz w:val="28"/>
+                          <w:szCs w:val="28"/>
+                        </w:rPr>
+                      </w:pPr>
+                      <w:r>
+                        <w:rPr>
+                          <w:rFonts w:ascii="Georgia" w:hAnsi="Georgia"/>
+                          <w:b/>
+                          <w:bCs/>
+                          <w:sz w:val="28"/>
+                          <w:szCs w:val="28"/>
+                        </w:rPr>
+                        <w:t>ESTUDIANTE:</w:t>
+                      </w:r>
+                      <w:r>
+                        <w:rPr>
+                          <w:rFonts w:ascii="Georgia" w:hAnsi="Georgia"/>
+                          <w:b/>
+                          <w:bCs/>
+                          <w:sz w:val="28"/>
+                          <w:szCs w:val="28"/>
+                        </w:rPr>
+                        <w:br/>
+                      </w:r>
+                      <w:r>
+                        <w:rPr>
+                          <w:rFonts w:ascii="Georgia" w:hAnsi="Georgia"/>
+                          <w:sz w:val="28"/>
+                          <w:szCs w:val="28"/>
+                        </w:rPr>
+                        <w:t>Carlos Eduardo Valencia Hernández</w:t>
+                      </w:r>
+                    </w:p>
+                    <w:p>
+                      <w:pPr>
+                        <w:jc w:val="center"/>
+                        <w:rPr>
+                          <w:rFonts w:ascii="Georgia" w:hAnsi="Georgia"/>
+                          <w:sz w:val="28"/>
+                          <w:szCs w:val="28"/>
+                        </w:rPr>
+                      </w:pPr>
+                    </w:p>
+                    <w:p>
+                      <w:pPr>
+                        <w:jc w:val="center"/>
+                        <w:rPr>
+                          <w:rFonts w:ascii="Georgia" w:hAnsi="Georgia"/>
+                          <w:sz w:val="28"/>
+                          <w:szCs w:val="28"/>
+                          <w:lang w:val="pt-BR"/>
+                        </w:rPr>
+                      </w:pPr>
+                      <w:r>
+                        <w:rPr>
+                          <w:rFonts w:ascii="Georgia" w:hAnsi="Georgia"/>
+                          <w:b/>
+                          <w:bCs/>
+                          <w:sz w:val="28"/>
+                          <w:szCs w:val="28"/>
+                          <w:lang w:val="pt-BR"/>
+                        </w:rPr>
+                        <w:t>DOCENTE</w:t>
+                      </w:r>
+                      <w:r>
+                        <w:rPr>
+                          <w:rFonts w:ascii="Georgia" w:hAnsi="Georgia"/>
+                          <w:sz w:val="28"/>
+                          <w:szCs w:val="28"/>
+                          <w:lang w:val="pt-BR"/>
+                        </w:rPr>
+                        <w:t>:</w:t>
+                      </w:r>
+                    </w:p>
+                    <w:p>
+                      <w:pPr>
+                        <w:jc w:val="center"/>
+                        <w:rPr>
+                          <w:rFonts w:ascii="Georgia" w:hAnsi="Georgia"/>
+                          <w:sz w:val="28"/>
+                          <w:szCs w:val="28"/>
+                          <w:lang w:val="pt-BR"/>
+                        </w:rPr>
+                      </w:pPr>
+                      <w:r>
+                        <w:rPr>
+                          <w:rFonts w:ascii="Georgia" w:hAnsi="Georgia"/>
+                          <w:sz w:val="28"/>
+                          <w:szCs w:val="28"/>
+                          <w:lang w:val="pt-BR"/>
+                        </w:rPr>
+                        <w:t>EDGAR ALEJANDRO SAGUNDO DUARTE</w:t>
+                      </w:r>
+                    </w:p>
+                  </w:txbxContent>
+                </v:textbox>
+              </v:shape>
+            </w:pict>
+          </mc:Fallback>
+        </mc:AlternateContent>
+      </w:r>
+      <w:r>
+        <w:rPr>
+          <w:noProof/>
+        </w:rPr>
+        <mc:AlternateContent>
+          <mc:Choice Requires="wpg">
+            <w:drawing>
+              <wp:anchor distT="0" distB="0" distL="114300" distR="114300" simplePos="0" relativeHeight="251663360" behindDoc="0" locked="0" layoutInCell="1" allowOverlap="1" wp14:anchorId="6F515471" wp14:editId="27577639">
+                <wp:simplePos x="0" y="0"/>
+                <wp:positionH relativeFrom="column">
+                  <wp:posOffset>306693</wp:posOffset>
+                </wp:positionH>
+                <wp:positionV relativeFrom="paragraph">
+                  <wp:posOffset>915073</wp:posOffset>
+                </wp:positionV>
+                <wp:extent cx="317500" cy="6275851"/>
+                <wp:effectExtent l="0" t="0" r="25400" b="48895"/>
+                <wp:wrapNone/>
+                <wp:docPr id="2031477265" name="Grupo 4"/>
+                <wp:cNvGraphicFramePr/>
+                <a:graphic xmlns:a="http://schemas.openxmlformats.org/drawingml/2006/main">
+                  <a:graphicData uri="http://schemas.microsoft.com/office/word/2010/wordprocessingGroup">
+                    <wpg:wgp>
+                      <wpg:cNvGrpSpPr/>
+                      <wpg:grpSpPr>
+                        <a:xfrm>
+                          <a:off x="0" y="0"/>
+                          <a:ext cx="317500" cy="6275851"/>
+                          <a:chOff x="0" y="0"/>
+                          <a:chExt cx="318052" cy="5760000"/>
+                        </a:xfrm>
+                      </wpg:grpSpPr>
+                      <wps:wsp>
+                        <wps:cNvPr id="385265410" name="Conector recto 2"/>
+                        <wps:cNvCnPr/>
+                        <wps:spPr>
+                          <a:xfrm>
+                            <a:off x="146011" y="0"/>
+                            <a:ext cx="0" cy="5760000"/>
+                          </a:xfrm>
+                          <a:prstGeom prst="line">
+                            <a:avLst/>
+                          </a:prstGeom>
+                          <a:ln w="76200">
+                            <a:solidFill>
+                              <a:srgbClr val="B00549"/>
+                            </a:solidFill>
+                          </a:ln>
+                        </wps:spPr>
+                        <wps:style>
+                          <a:lnRef idx="2">
+                            <a:schemeClr val="accent1"/>
+                          </a:lnRef>
+                          <a:fillRef idx="0">
+                            <a:schemeClr val="accent1"/>
+                          </a:fillRef>
+                          <a:effectRef idx="1">
+                            <a:schemeClr val="accent1"/>
+                          </a:effectRef>
+                          <a:fontRef idx="minor">
+                            <a:schemeClr val="tx1"/>
+                          </a:fontRef>
+                        </wps:style>
+                        <wps:bodyPr/>
+                      </wps:wsp>
+                      <wps:wsp>
+                        <wps:cNvPr id="1027687944" name="Conector recto 2"/>
+                        <wps:cNvCnPr/>
+                        <wps:spPr>
+                          <a:xfrm>
+                            <a:off x="318052" y="5680"/>
+                            <a:ext cx="0" cy="5040000"/>
+                          </a:xfrm>
+                          <a:prstGeom prst="line">
+                            <a:avLst/>
+                          </a:prstGeom>
+                          <a:ln>
+                            <a:solidFill>
+                              <a:srgbClr val="B00549"/>
+                            </a:solidFill>
+                          </a:ln>
+                        </wps:spPr>
+                        <wps:style>
+                          <a:lnRef idx="3">
+                            <a:schemeClr val="dk1"/>
+                          </a:lnRef>
+                          <a:fillRef idx="0">
+                            <a:schemeClr val="dk1"/>
+                          </a:fillRef>
+                          <a:effectRef idx="2">
+                            <a:schemeClr val="dk1"/>
+                          </a:effectRef>
+                          <a:fontRef idx="minor">
+                            <a:schemeClr val="tx1"/>
+                          </a:fontRef>
+                        </wps:style>
+                        <wps:bodyPr/>
+                      </wps:wsp>
+                      <wps:wsp>
+                        <wps:cNvPr id="86592179" name="Conector recto 2"/>
+                        <wps:cNvCnPr/>
+                        <wps:spPr>
+                          <a:xfrm>
+                            <a:off x="0" y="0"/>
+                            <a:ext cx="0" cy="5040000"/>
+                          </a:xfrm>
+                          <a:prstGeom prst="line">
+                            <a:avLst/>
+                          </a:prstGeom>
+                          <a:ln>
+                            <a:solidFill>
+                              <a:srgbClr val="B00549"/>
+                            </a:solidFill>
+                          </a:ln>
+                        </wps:spPr>
+                        <wps:style>
+                          <a:lnRef idx="3">
+                            <a:schemeClr val="dk1"/>
+                          </a:lnRef>
+                          <a:fillRef idx="0">
+                            <a:schemeClr val="dk1"/>
+                          </a:fillRef>
+                          <a:effectRef idx="2">
+                            <a:schemeClr val="dk1"/>
+                          </a:effectRef>
+                          <a:fontRef idx="minor">
+                            <a:schemeClr val="tx1"/>
+                          </a:fontRef>
+                        </wps:style>
+                        <wps:bodyPr/>
+                      </wps:wsp>
+                    </wpg:wgp>
+                  </a:graphicData>
+                </a:graphic>
+                <wp14:sizeRelV relativeFrom="margin">
+                  <wp14:pctHeight>0</wp14:pctHeight>
+                </wp14:sizeRelV>
+              </wp:anchor>
+            </w:drawing>
+          </mc:Choice>
+          <mc:Fallback>
+            <w:pict>
+              <v:group w14:anchorId="12216BCD" id="Grupo 4" o:spid="_x0000_s1026" style="position:absolute;margin-left:24.15pt;margin-top:72.05pt;width:25pt;height:494.15pt;z-index:251663360;mso-height-relative:margin" coordsize="3180,57600" o:gfxdata="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">
+                <v:line id="Conector recto 2" o:spid="_x0000_s1027" style="position:absolute;visibility:visible;mso-wrap-style:square" from="1460,0" to="1460,57600" o:connectortype="straight" o:gfxdata="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" strokecolor="#b00549" strokeweight="6pt">
+                  <v:stroke joinstyle="miter"/>
+                </v:line>
+                <v:line id="Conector recto 2" o:spid="_x0000_s1028" style="position:absolute;visibility:visible;mso-wrap-style:square" from="3180,56" to="3180,50456" o:connectortype="straight" o:gfxdata="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" strokecolor="#b00549" strokeweight="2pt">
+                  <v:stroke joinstyle="miter"/>
+                </v:line>
+                <v:line id="Conector recto 2" o:spid="_x0000_s1029" style="position:absolute;visibility:visible;mso-wrap-style:square" from="0,0" to="0,50400" o:connectortype="straight" o:gfxdata="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" strokecolor="#b00549" strokeweight="2pt">
+                  <v:stroke joinstyle="miter"/>
+                </v:line>
+              </v:group>
+            </w:pict>
+          </mc:Fallback>
+        </mc:AlternateContent>
+      </w:r>
+      <w:r>
+        <w:br w:type="page"/>
       </w:r>
     </w:p>
     <w:sectPr>

</xml_diff>